<commit_message>
kleine aanpassingen handleiding (woordgeving, instructies voor config aanpassen.
</commit_message>
<xml_diff>
--- a/Opleverset/Documentatie/Gebruikers handleiding.docx
+++ b/Opleverset/Documentatie/Gebruikers handleiding.docx
@@ -28,7 +28,7 @@
         <w:p/>
         <w:p>
           <w:pPr>
-            <w:pStyle w:val="Titel"/>
+            <w:pStyle w:val="Title"/>
           </w:pPr>
           <w:r>
             <w:rPr>
@@ -504,7 +504,7 @@
                             <w:txbxContent>
                               <w:p>
                                 <w:pPr>
-                                  <w:pStyle w:val="Geenafstand"/>
+                                  <w:pStyle w:val="NoSpacing"/>
                                   <w:rPr>
                                     <w:color w:val="7F7F7F" w:themeColor="text1" w:themeTint="80"/>
                                     <w:sz w:val="18"/>
@@ -619,7 +619,7 @@
                       <w:txbxContent>
                         <w:p>
                           <w:pPr>
-                            <w:pStyle w:val="Geenafstand"/>
+                            <w:pStyle w:val="NoSpacing"/>
                             <w:rPr>
                               <w:color w:val="7F7F7F" w:themeColor="text1" w:themeTint="80"/>
                               <w:sz w:val="18"/>
@@ -791,7 +791,7 @@
                                 <w:sdtContent>
                                   <w:p>
                                     <w:pPr>
-                                      <w:pStyle w:val="Geenafstand"/>
+                                      <w:pStyle w:val="NoSpacing"/>
                                       <w:spacing w:before="40" w:after="40"/>
                                       <w:rPr>
                                         <w:caps/>
@@ -814,7 +814,7 @@
                               </w:sdt>
                               <w:p>
                                 <w:pPr>
-                                  <w:pStyle w:val="Geenafstand"/>
+                                  <w:pStyle w:val="NoSpacing"/>
                                   <w:spacing w:before="40" w:after="40"/>
                                   <w:rPr>
                                     <w:caps/>
@@ -882,7 +882,7 @@
                           <w:sdtContent>
                             <w:p>
                               <w:pPr>
-                                <w:pStyle w:val="Geenafstand"/>
+                                <w:pStyle w:val="NoSpacing"/>
                                 <w:spacing w:before="40" w:after="40"/>
                                 <w:rPr>
                                   <w:caps/>
@@ -905,7 +905,7 @@
                         </w:sdt>
                         <w:p>
                           <w:pPr>
-                            <w:pStyle w:val="Geenafstand"/>
+                            <w:pStyle w:val="NoSpacing"/>
                             <w:spacing w:before="40" w:after="40"/>
                             <w:rPr>
                               <w:caps/>
@@ -1028,7 +1028,7 @@
                                 <w:sdtContent>
                                   <w:p>
                                     <w:pPr>
-                                      <w:pStyle w:val="Geenafstand"/>
+                                      <w:pStyle w:val="NoSpacing"/>
                                       <w:jc w:val="right"/>
                                       <w:rPr>
                                         <w:color w:val="FFFFFF" w:themeColor="background1"/>
@@ -1106,7 +1106,7 @@
                           <w:sdtContent>
                             <w:p>
                               <w:pPr>
-                                <w:pStyle w:val="Geenafstand"/>
+                                <w:pStyle w:val="NoSpacing"/>
                                 <w:jc w:val="right"/>
                                 <w:rPr>
                                   <w:color w:val="FFFFFF" w:themeColor="background1"/>
@@ -1173,7 +1173,7 @@
           <w:sdtContent>
             <w:p>
               <w:pPr>
-                <w:pStyle w:val="Kopvaninhoudsopgave"/>
+                <w:pStyle w:val="TOCHeading"/>
               </w:pPr>
               <w:r>
                 <w:t>Inhoudsopgave</w:t>
@@ -1181,7 +1181,7 @@
             </w:p>
             <w:p>
               <w:pPr>
-                <w:pStyle w:val="Inhopg1"/>
+                <w:pStyle w:val="TOC1"/>
                 <w:tabs>
                   <w:tab w:val="right" w:leader="dot" w:pos="9062"/>
                 </w:tabs>
@@ -1253,7 +1253,7 @@
             </w:p>
             <w:p>
               <w:pPr>
-                <w:pStyle w:val="Inhopg1"/>
+                <w:pStyle w:val="TOC1"/>
                 <w:tabs>
                   <w:tab w:val="right" w:leader="dot" w:pos="9062"/>
                 </w:tabs>
@@ -1316,7 +1316,7 @@
             </w:p>
             <w:p>
               <w:pPr>
-                <w:pStyle w:val="Inhopg1"/>
+                <w:pStyle w:val="TOC1"/>
                 <w:tabs>
                   <w:tab w:val="right" w:leader="dot" w:pos="9062"/>
                 </w:tabs>
@@ -1379,7 +1379,7 @@
             </w:p>
             <w:p>
               <w:pPr>
-                <w:pStyle w:val="Inhopg2"/>
+                <w:pStyle w:val="TOC2"/>
                 <w:tabs>
                   <w:tab w:val="right" w:leader="dot" w:pos="9062"/>
                 </w:tabs>
@@ -1442,7 +1442,7 @@
             </w:p>
             <w:p>
               <w:pPr>
-                <w:pStyle w:val="Inhopg2"/>
+                <w:pStyle w:val="TOC2"/>
                 <w:tabs>
                   <w:tab w:val="right" w:leader="dot" w:pos="9062"/>
                 </w:tabs>
@@ -1505,7 +1505,7 @@
             </w:p>
             <w:p>
               <w:pPr>
-                <w:pStyle w:val="Inhopg1"/>
+                <w:pStyle w:val="TOC1"/>
                 <w:tabs>
                   <w:tab w:val="right" w:leader="dot" w:pos="9062"/>
                 </w:tabs>
@@ -1568,7 +1568,7 @@
             </w:p>
             <w:p>
               <w:pPr>
-                <w:pStyle w:val="Inhopg2"/>
+                <w:pStyle w:val="TOC2"/>
                 <w:tabs>
                   <w:tab w:val="right" w:leader="dot" w:pos="9062"/>
                 </w:tabs>
@@ -1631,7 +1631,7 @@
             </w:p>
             <w:p>
               <w:pPr>
-                <w:pStyle w:val="Inhopg2"/>
+                <w:pStyle w:val="TOC2"/>
                 <w:tabs>
                   <w:tab w:val="right" w:leader="dot" w:pos="9062"/>
                 </w:tabs>
@@ -1694,7 +1694,7 @@
             </w:p>
             <w:p>
               <w:pPr>
-                <w:pStyle w:val="Inhopg1"/>
+                <w:pStyle w:val="TOC1"/>
                 <w:tabs>
                   <w:tab w:val="right" w:leader="dot" w:pos="9062"/>
                 </w:tabs>
@@ -1757,7 +1757,7 @@
             </w:p>
             <w:p>
               <w:pPr>
-                <w:pStyle w:val="Inhopg1"/>
+                <w:pStyle w:val="TOC1"/>
                 <w:tabs>
                   <w:tab w:val="right" w:leader="dot" w:pos="9062"/>
                 </w:tabs>
@@ -1820,7 +1820,7 @@
             </w:p>
             <w:p>
               <w:pPr>
-                <w:pStyle w:val="Inhopg1"/>
+                <w:pStyle w:val="TOC1"/>
                 <w:tabs>
                   <w:tab w:val="right" w:leader="dot" w:pos="9062"/>
                 </w:tabs>
@@ -1909,7 +1909,7 @@
           <w:bookmarkStart w:id="0" w:name="_Toc223435302"/>
           <w:r>
             <w:rPr>
-              <w:rStyle w:val="Kop1Char"/>
+              <w:rStyle w:val="Heading1Char"/>
             </w:rPr>
             <w:lastRenderedPageBreak/>
             <w:t>Inleiding</w:t>
@@ -1923,12 +1923,21 @@
           <w:r>
             <w:t xml:space="preserve">Dit document beschrijft hoe je het </w:t>
           </w:r>
+          <w:proofErr w:type="spellStart"/>
           <w:r>
             <w:rPr>
               <w:b/>
               <w:bCs/>
             </w:rPr>
-            <w:t>Floating Farm Stabilisatiesysteem</w:t>
+            <w:t>Floating</w:t>
+          </w:r>
+          <w:proofErr w:type="spellEnd"/>
+          <w:r>
+            <w:rPr>
+              <w:b/>
+              <w:bCs/>
+            </w:rPr>
+            <w:t xml:space="preserve"> Farm Stabilisatiesysteem</w:t>
           </w:r>
           <w:r>
             <w:rPr>
@@ -1938,8 +1947,37 @@
             <w:t>(demo)</w:t>
           </w:r>
           <w:r>
-            <w:t xml:space="preserve"> in gebruik neemt. Het systeem is een schaalmodel van een stabilisatiemechanisme voor de Floating Farm. Het systeem meet de kanteling van het platform via een gyroscoop/accelerometersensor (MPU6050), berekent de afwijking ten opzichte van een waterpasreferentie en stuurt vier motoren aan om het platform te stabiliseren. Een Unity-dashboard visualiseert de rotatie in realtime</w:t>
-          </w:r>
+            <w:t xml:space="preserve"> in gebruik neemt. Het systeem is een schaalmodel van een stabilisatiemechanisme voor de </w:t>
+          </w:r>
+          <w:proofErr w:type="spellStart"/>
+          <w:r>
+            <w:t>Floating</w:t>
+          </w:r>
+          <w:proofErr w:type="spellEnd"/>
+          <w:r>
+            <w:t xml:space="preserve"> Farm. Het systeem meet de kanteling van het platform via een gyroscoop/</w:t>
+          </w:r>
+          <w:proofErr w:type="spellStart"/>
+          <w:r>
+            <w:t>accelerometersensor</w:t>
+          </w:r>
+          <w:proofErr w:type="spellEnd"/>
+          <w:r>
+            <w:t xml:space="preserve"> (MPU6050), berekent de afwijking ten opzichte van een waterpasreferentie en stuurt vier motoren aan om het platform te stabiliseren. Een </w:t>
+          </w:r>
+          <w:proofErr w:type="spellStart"/>
+          <w:r>
+            <w:t>Unity</w:t>
+          </w:r>
+          <w:proofErr w:type="spellEnd"/>
+          <w:r>
+            <w:t xml:space="preserve">-dashboard visualiseert de rotatie in </w:t>
+          </w:r>
+          <w:proofErr w:type="spellStart"/>
+          <w:r>
+            <w:t>realtime</w:t>
+          </w:r>
+          <w:proofErr w:type="spellEnd"/>
           <w:r>
             <w:t>.</w:t>
           </w:r>
@@ -1949,9 +1987,9 @@
         </w:p>
         <w:p>
           <w:pPr>
-            <w:pStyle w:val="Kop1"/>
+            <w:pStyle w:val="Heading1"/>
             <w:rPr>
-              <w:rStyle w:val="Kop2Char"/>
+              <w:rStyle w:val="Heading2Char"/>
               <w:sz w:val="32"/>
               <w:szCs w:val="32"/>
             </w:rPr>
@@ -1959,7 +1997,7 @@
           <w:bookmarkStart w:id="1" w:name="_Toc223435303"/>
           <w:r>
             <w:rPr>
-              <w:rStyle w:val="Kop2Char"/>
+              <w:rStyle w:val="Heading2Char"/>
               <w:sz w:val="32"/>
               <w:szCs w:val="32"/>
             </w:rPr>
@@ -1969,7 +2007,15 @@
         </w:p>
         <w:p>
           <w:r>
-            <w:t xml:space="preserve">Het system bestaat uit 3 onderdelen de esp32, MPU6050 en Unity Dashboard(GUI). </w:t>
+            <w:t xml:space="preserve">Het system bestaat uit 3 onderdelen de esp32, MPU6050 en </w:t>
+          </w:r>
+          <w:proofErr w:type="spellStart"/>
+          <w:r>
+            <w:t>Unity</w:t>
+          </w:r>
+          <w:proofErr w:type="spellEnd"/>
+          <w:r>
+            <w:t xml:space="preserve"> Dashboard(GUI). </w:t>
           </w:r>
         </w:p>
         <w:p>
@@ -1997,12 +2043,25 @@
             <w:t>:</w:t>
           </w:r>
           <w:r>
-            <w:t xml:space="preserve"> Gyroscoop- en accelerometersensor, verbonden via I2C met de ESP32. Meet de rotatie van het platform.</w:t>
-          </w:r>
-        </w:p>
-        <w:p>
-          <w:r>
-            <w:t>Unity Dashboard</w:t>
+            <w:t xml:space="preserve"> Gyroscoop- en </w:t>
+          </w:r>
+          <w:proofErr w:type="spellStart"/>
+          <w:r>
+            <w:t>accelerometersensor</w:t>
+          </w:r>
+          <w:proofErr w:type="spellEnd"/>
+          <w:r>
+            <w:t>, verbonden via I2C met de ESP32. Meet de rotatie van het platform.</w:t>
+          </w:r>
+        </w:p>
+        <w:p>
+          <w:proofErr w:type="spellStart"/>
+          <w:r>
+            <w:t>Unity</w:t>
+          </w:r>
+          <w:proofErr w:type="spellEnd"/>
+          <w:r>
+            <w:t xml:space="preserve"> Dashboard</w:t>
           </w:r>
           <w:r>
             <w:t>:</w:t>
@@ -2014,12 +2073,23 @@
             <w:t>seriële</w:t>
           </w:r>
           <w:r>
-            <w:t xml:space="preserve"> data van de ESP32 ontvangt en de 3D-rotatie van het platform visualiseert.</w:t>
+            <w:t xml:space="preserve"> data van de ESP32 ontvangt en de 3D-rotatie van het platform visualiseer</w:t>
+          </w:r>
+          <w:r>
+            <w:t>t (</w:t>
+          </w:r>
+          <w:proofErr w:type="spellStart"/>
+          <w:r>
+            <w:t>Opleverset</w:t>
+          </w:r>
+          <w:proofErr w:type="spellEnd"/>
+          <w:r>
+            <w:t>/User Interface/FloatingFarm.exe).</w:t>
           </w:r>
         </w:p>
         <w:p>
           <w:pPr>
-            <w:pStyle w:val="Kop1"/>
+            <w:pStyle w:val="Heading1"/>
           </w:pPr>
           <w:bookmarkStart w:id="2" w:name="_Toc223435304"/>
           <w:r>
@@ -2066,7 +2136,7 @@
         <w:p/>
         <w:p>
           <w:pPr>
-            <w:pStyle w:val="Kop2"/>
+            <w:pStyle w:val="Heading2"/>
           </w:pPr>
           <w:bookmarkStart w:id="3" w:name="_Toc223435305"/>
           <w:r>
@@ -2088,12 +2158,26 @@
             <w:rPr>
               <w:color w:val="0070C0"/>
             </w:rPr>
-            <w:t>(…\Opleverset\Ontwerpen\Elektrische schema's)</w:t>
+            <w:t>(…\</w:t>
+          </w:r>
+          <w:proofErr w:type="spellStart"/>
+          <w:r>
+            <w:rPr>
+              <w:color w:val="0070C0"/>
+            </w:rPr>
+            <w:t>Opleverset</w:t>
+          </w:r>
+          <w:proofErr w:type="spellEnd"/>
+          <w:r>
+            <w:rPr>
+              <w:color w:val="0070C0"/>
+            </w:rPr>
+            <w:t>\Ontwerpen\Elektrische schema's)</w:t>
           </w:r>
         </w:p>
         <w:tbl>
           <w:tblPr>
-            <w:tblStyle w:val="Tabelraster"/>
+            <w:tblStyle w:val="TableGrid"/>
             <w:tblW w:w="0" w:type="auto"/>
             <w:tblLook w:val="04A0" w:firstRow="1" w:lastRow="0" w:firstColumn="1" w:lastColumn="0" w:noHBand="0" w:noVBand="1"/>
           </w:tblPr>
@@ -2231,7 +2315,7 @@
         <w:p/>
         <w:p>
           <w:pPr>
-            <w:pStyle w:val="Kop2"/>
+            <w:pStyle w:val="Heading2"/>
           </w:pPr>
           <w:bookmarkStart w:id="4" w:name="_Toc223435306"/>
           <w:r>
@@ -2241,7 +2325,15 @@
         </w:p>
         <w:p>
           <w:r>
-            <w:t>Sluit de motoren aan volgens de nummering op de Mosfets en de nummering op de acrylplaat</w:t>
+            <w:t xml:space="preserve">Sluit de motoren aan volgens de nummering op de </w:t>
+          </w:r>
+          <w:proofErr w:type="spellStart"/>
+          <w:r>
+            <w:t>Mosfets</w:t>
+          </w:r>
+          <w:proofErr w:type="spellEnd"/>
+          <w:r>
+            <w:t xml:space="preserve"> en de nummering op de acrylplaat</w:t>
           </w:r>
           <w:r>
             <w:br/>
@@ -2249,12 +2341,19 @@
           </w:r>
           <w:r>
             <w:br/>
-            <w:t>Orientatie van de ESP32 staat ook aangegeven, moet matchen</w:t>
+          </w:r>
+          <w:proofErr w:type="spellStart"/>
+          <w:r>
+            <w:t>Orientatie</w:t>
+          </w:r>
+          <w:proofErr w:type="spellEnd"/>
+          <w:r>
+            <w:t xml:space="preserve"> van de ESP32 staat ook aangegeven, moet matchen</w:t>
           </w:r>
         </w:p>
         <w:tbl>
           <w:tblPr>
-            <w:tblStyle w:val="Tabelraster"/>
+            <w:tblStyle w:val="TableGrid"/>
             <w:tblW w:w="0" w:type="auto"/>
             <w:tblLook w:val="04A0" w:firstRow="1" w:lastRow="0" w:firstColumn="1" w:lastColumn="0" w:noHBand="0" w:noVBand="1"/>
           </w:tblPr>
@@ -2405,7 +2504,7 @@
         </w:tbl>
         <w:p>
           <w:pPr>
-            <w:pStyle w:val="Kop2"/>
+            <w:pStyle w:val="Heading2"/>
           </w:pPr>
         </w:p>
         <w:p>
@@ -2423,7 +2522,7 @@
         </w:p>
         <w:p>
           <w:pPr>
-            <w:pStyle w:val="Kop1"/>
+            <w:pStyle w:val="Heading1"/>
           </w:pPr>
           <w:bookmarkStart w:id="5" w:name="_Toc223435307"/>
           <w:r>
@@ -2434,7 +2533,7 @@
         </w:p>
         <w:p>
           <w:pPr>
-            <w:pStyle w:val="Kop2"/>
+            <w:pStyle w:val="Heading2"/>
           </w:pPr>
           <w:bookmarkStart w:id="6" w:name="_Toc223435308"/>
           <w:r>
@@ -2447,12 +2546,14 @@
             <w:t xml:space="preserve">- </w:t>
           </w:r>
           <w:hyperlink r:id="rId12" w:history="1">
+            <w:proofErr w:type="spellStart"/>
             <w:r>
               <w:rPr>
                 <w:rStyle w:val="Hyperlink"/>
               </w:rPr>
               <w:t>PlatformIO</w:t>
             </w:r>
+            <w:proofErr w:type="spellEnd"/>
           </w:hyperlink>
           <w:r>
             <w:t xml:space="preserve"> (extensie voor VS Code of standalone)</w:t>
@@ -2466,17 +2567,41 @@
             <w:t>geïnstalleerd</w:t>
           </w:r>
           <w:r>
-            <w:t xml:space="preserve"> via PlatformIO):</w:t>
-          </w:r>
-        </w:p>
-        <w:p>
-          <w:r>
-            <w:t xml:space="preserve">  - adafruit/Adafruit MPU6050 @ ^2.2.6</w:t>
-          </w:r>
-        </w:p>
-        <w:p>
-          <w:r>
-            <w:t xml:space="preserve">  - Adafruit Unified Sensor</w:t>
+            <w:t xml:space="preserve"> via </w:t>
+          </w:r>
+          <w:proofErr w:type="spellStart"/>
+          <w:r>
+            <w:t>PlatformIO</w:t>
+          </w:r>
+          <w:proofErr w:type="spellEnd"/>
+          <w:r>
+            <w:t>):</w:t>
+          </w:r>
+        </w:p>
+        <w:p>
+          <w:r>
+            <w:t xml:space="preserve">  - </w:t>
+          </w:r>
+          <w:proofErr w:type="spellStart"/>
+          <w:r>
+            <w:t>adafruit</w:t>
+          </w:r>
+          <w:proofErr w:type="spellEnd"/>
+          <w:r>
+            <w:t>/Adafruit MPU6050 @ ^2.2.6</w:t>
+          </w:r>
+        </w:p>
+        <w:p>
+          <w:r>
+            <w:t xml:space="preserve">  - Adafruit </w:t>
+          </w:r>
+          <w:proofErr w:type="spellStart"/>
+          <w:r>
+            <w:t>Unified</w:t>
+          </w:r>
+          <w:proofErr w:type="spellEnd"/>
+          <w:r>
+            <w:t xml:space="preserve"> Sensor</w:t>
           </w:r>
           <w:r>
             <w:t xml:space="preserve"> </w:t>
@@ -2488,7 +2613,15 @@
             <w:t xml:space="preserve"> geïnstalleerd </w:t>
           </w:r>
           <w:r>
-            <w:t>als dependency)</w:t>
+            <w:t xml:space="preserve">als </w:t>
+          </w:r>
+          <w:proofErr w:type="spellStart"/>
+          <w:r>
+            <w:t>dependency</w:t>
+          </w:r>
+          <w:proofErr w:type="spellEnd"/>
+          <w:r>
+            <w:t>)</w:t>
           </w:r>
         </w:p>
         <w:p>
@@ -2504,12 +2637,26 @@
             <w:rPr>
               <w:lang w:val="en-US"/>
             </w:rPr>
-            <w:t>- Wire` (standaard Arduino-library)</w:t>
+            <w:t>- Wire` (</w:t>
+          </w:r>
+          <w:proofErr w:type="spellStart"/>
+          <w:r>
+            <w:rPr>
+              <w:lang w:val="en-US"/>
+            </w:rPr>
+            <w:t>standaard</w:t>
+          </w:r>
+          <w:proofErr w:type="spellEnd"/>
+          <w:r>
+            <w:rPr>
+              <w:lang w:val="en-US"/>
+            </w:rPr>
+            <w:t xml:space="preserve"> Arduino-library)</w:t>
           </w:r>
         </w:p>
         <w:p>
           <w:pPr>
-            <w:pStyle w:val="Kop2"/>
+            <w:pStyle w:val="Heading2"/>
             <w:rPr>
               <w:lang w:val="en-US"/>
             </w:rPr>
@@ -2560,12 +2707,34 @@
             <w:rPr>
               <w:lang w:val="en-US"/>
             </w:rPr>
-            <w:t xml:space="preserve"> (of hoger)</w:t>
-          </w:r>
-        </w:p>
-        <w:p>
-          <w:r>
-            <w:t>- Universal Render Pipeline (URP) – wordt meegeleverd in het project</w:t>
+            <w:t xml:space="preserve"> (of </w:t>
+          </w:r>
+          <w:proofErr w:type="spellStart"/>
+          <w:r>
+            <w:rPr>
+              <w:lang w:val="en-US"/>
+            </w:rPr>
+            <w:t>hoger</w:t>
+          </w:r>
+          <w:proofErr w:type="spellEnd"/>
+          <w:r>
+            <w:rPr>
+              <w:lang w:val="en-US"/>
+            </w:rPr>
+            <w:t>)</w:t>
+          </w:r>
+        </w:p>
+        <w:p>
+          <w:r>
+            <w:t xml:space="preserve">- Universal </w:t>
+          </w:r>
+          <w:proofErr w:type="spellStart"/>
+          <w:r>
+            <w:t>Render</w:t>
+          </w:r>
+          <w:proofErr w:type="spellEnd"/>
+          <w:r>
+            <w:t xml:space="preserve"> Pipeline (URP) – wordt meegeleverd in het project</w:t>
           </w:r>
         </w:p>
         <w:p>
@@ -2578,7 +2747,21 @@
             <w:rPr>
               <w:lang w:val="en-US"/>
             </w:rPr>
-            <w:t xml:space="preserve">- correcte  </w:t>
+            <w:t xml:space="preserve">- </w:t>
+          </w:r>
+          <w:proofErr w:type="spellStart"/>
+          <w:r>
+            <w:rPr>
+              <w:lang w:val="en-US"/>
+            </w:rPr>
+            <w:t>correcte</w:t>
+          </w:r>
+          <w:proofErr w:type="spellEnd"/>
+          <w:r>
+            <w:rPr>
+              <w:lang w:val="en-US"/>
+            </w:rPr>
+            <w:t xml:space="preserve">  </w:t>
           </w:r>
           <w:r>
             <w:rPr>
@@ -2596,7 +2779,7 @@
         </w:p>
         <w:p>
           <w:pPr>
-            <w:pStyle w:val="Kop1"/>
+            <w:pStyle w:val="Heading1"/>
             <w:rPr>
               <w:lang w:val="en-US"/>
             </w:rPr>
@@ -2606,25 +2789,49 @@
             <w:rPr>
               <w:lang w:val="en-US"/>
             </w:rPr>
-            <w:t>ESP32 firmware uploaden</w:t>
+            <w:t xml:space="preserve">ESP32 firmware </w:t>
+          </w:r>
+          <w:proofErr w:type="spellStart"/>
+          <w:r>
+            <w:rPr>
+              <w:lang w:val="en-US"/>
+            </w:rPr>
+            <w:t>uploaden</w:t>
           </w:r>
           <w:bookmarkEnd w:id="8"/>
+          <w:proofErr w:type="spellEnd"/>
         </w:p>
         <w:p>
           <w:pPr>
-            <w:pStyle w:val="Lijstalinea"/>
+            <w:pStyle w:val="ListParagraph"/>
             <w:numPr>
               <w:ilvl w:val="0"/>
               <w:numId w:val="8"/>
             </w:numPr>
           </w:pPr>
           <w:r>
-            <w:t>Open de map “Opleverset/Code/ESP32/”in VS Code met PlatformIO.</w:t>
+            <w:t>Open de map “</w:t>
+          </w:r>
+          <w:proofErr w:type="spellStart"/>
+          <w:r>
+            <w:t>Opleverset</w:t>
+          </w:r>
+          <w:proofErr w:type="spellEnd"/>
+          <w:r>
+            <w:t xml:space="preserve">/Code/ESP32/”in VS Code met </w:t>
+          </w:r>
+          <w:proofErr w:type="spellStart"/>
+          <w:r>
+            <w:t>PlatformIO</w:t>
+          </w:r>
+          <w:proofErr w:type="spellEnd"/>
+          <w:r>
+            <w:t>.</w:t>
           </w:r>
         </w:p>
         <w:p>
           <w:pPr>
-            <w:pStyle w:val="Lijstalinea"/>
+            <w:pStyle w:val="ListParagraph"/>
             <w:numPr>
               <w:ilvl w:val="0"/>
               <w:numId w:val="8"/>
@@ -2648,19 +2855,27 @@
         </w:p>
         <w:p>
           <w:pPr>
-            <w:pStyle w:val="Lijstalinea"/>
+            <w:pStyle w:val="ListParagraph"/>
             <w:numPr>
               <w:ilvl w:val="0"/>
               <w:numId w:val="8"/>
             </w:numPr>
           </w:pPr>
           <w:r>
-            <w:t>Klik op de knop Upload (pijltje omhoog) in de PlatformIO-toolbar.</w:t>
+            <w:t xml:space="preserve">Klik op de knop Upload (pijltje omhoog) in de </w:t>
+          </w:r>
+          <w:proofErr w:type="spellStart"/>
+          <w:r>
+            <w:t>PlatformIO</w:t>
+          </w:r>
+          <w:proofErr w:type="spellEnd"/>
+          <w:r>
+            <w:t>-toolbar.</w:t>
           </w:r>
         </w:p>
         <w:p>
           <w:pPr>
-            <w:pStyle w:val="Lijstalinea"/>
+            <w:pStyle w:val="ListParagraph"/>
             <w:numPr>
               <w:ilvl w:val="0"/>
               <w:numId w:val="8"/>
@@ -2672,7 +2887,7 @@
         </w:p>
         <w:p>
           <w:pPr>
-            <w:pStyle w:val="Lijstalinea"/>
+            <w:pStyle w:val="ListParagraph"/>
             <w:numPr>
               <w:ilvl w:val="0"/>
               <w:numId w:val="8"/>
@@ -2685,7 +2900,15 @@
             <w:t>Seriële</w:t>
           </w:r>
           <w:r>
-            <w:t xml:space="preserve"> Monitor (baudrate: `115200`) om te controleren dat de MPU6050 correct wordt gevonden</w:t>
+            <w:t xml:space="preserve"> Monitor (</w:t>
+          </w:r>
+          <w:proofErr w:type="spellStart"/>
+          <w:r>
+            <w:t>baudrate</w:t>
+          </w:r>
+          <w:proofErr w:type="spellEnd"/>
+          <w:r>
+            <w:t>: `115200`) om te controleren dat de MPU6050 correct wordt gevonden</w:t>
           </w:r>
         </w:p>
         <w:p/>
@@ -2704,7 +2927,7 @@
         </w:p>
         <w:p>
           <w:pPr>
-            <w:pStyle w:val="Kop1"/>
+            <w:pStyle w:val="Heading1"/>
           </w:pPr>
           <w:r>
             <w:lastRenderedPageBreak/>
@@ -2719,7 +2942,7 @@
         <w:p/>
         <w:p>
           <w:pPr>
-            <w:pStyle w:val="Kop2"/>
+            <w:pStyle w:val="Heading2"/>
             <w:rPr>
               <w:rFonts w:eastAsia="Arial"/>
             </w:rPr>
@@ -2749,7 +2972,7 @@
         </w:p>
         <w:p>
           <w:pPr>
-            <w:pStyle w:val="Lijstalinea"/>
+            <w:pStyle w:val="ListParagraph"/>
             <w:numPr>
               <w:ilvl w:val="0"/>
               <w:numId w:val="10"/>
@@ -2763,7 +2986,7 @@
         </w:p>
         <w:p>
           <w:pPr>
-            <w:pStyle w:val="Lijstalinea"/>
+            <w:pStyle w:val="ListParagraph"/>
             <w:numPr>
               <w:ilvl w:val="0"/>
               <w:numId w:val="10"/>
@@ -2777,7 +3000,7 @@
         </w:p>
         <w:p>
           <w:pPr>
-            <w:pStyle w:val="Lijstalinea"/>
+            <w:pStyle w:val="ListParagraph"/>
             <w:numPr>
               <w:ilvl w:val="0"/>
               <w:numId w:val="10"/>
@@ -2791,7 +3014,7 @@
         </w:p>
         <w:p>
           <w:pPr>
-            <w:pStyle w:val="Lijstalinea"/>
+            <w:pStyle w:val="ListParagraph"/>
             <w:numPr>
               <w:ilvl w:val="0"/>
               <w:numId w:val="10"/>
@@ -2805,7 +3028,7 @@
         </w:p>
         <w:p>
           <w:pPr>
-            <w:pStyle w:val="Lijstalinea"/>
+            <w:pStyle w:val="ListParagraph"/>
             <w:spacing w:after="0" w:line="240" w:lineRule="auto"/>
             <w:contextualSpacing w:val="0"/>
           </w:pPr>
@@ -2865,14 +3088,14 @@
         </w:p>
         <w:p>
           <w:pPr>
-            <w:pStyle w:val="Lijstalinea"/>
+            <w:pStyle w:val="ListParagraph"/>
             <w:spacing w:after="0" w:line="240" w:lineRule="auto"/>
             <w:contextualSpacing w:val="0"/>
           </w:pPr>
         </w:p>
         <w:p>
           <w:pPr>
-            <w:pStyle w:val="Lijstalinea"/>
+            <w:pStyle w:val="ListParagraph"/>
             <w:pBdr>
               <w:top w:val="single" w:sz="2" w:space="0" w:color="FFAA00"/>
             </w:pBdr>
@@ -2903,7 +3126,7 @@
         </w:p>
         <w:p>
           <w:pPr>
-            <w:pStyle w:val="Lijstalinea"/>
+            <w:pStyle w:val="ListParagraph"/>
             <w:pBdr>
               <w:top w:val="single" w:sz="2" w:space="0" w:color="FFAA00"/>
             </w:pBdr>
@@ -2912,7 +3135,7 @@
         </w:p>
         <w:p>
           <w:pPr>
-            <w:pStyle w:val="Kop2"/>
+            <w:pStyle w:val="Heading2"/>
           </w:pPr>
           <w:r>
             <w:t>2. Aansluiten van de ESP32</w:t>
@@ -2920,7 +3143,7 @@
         </w:p>
         <w:p>
           <w:pPr>
-            <w:pStyle w:val="Lijstalinea"/>
+            <w:pStyle w:val="ListParagraph"/>
             <w:ind w:left="0"/>
           </w:pPr>
           <w:r>
@@ -2929,12 +3152,12 @@
         </w:p>
         <w:p>
           <w:pPr>
-            <w:pStyle w:val="Lijstalinea"/>
+            <w:pStyle w:val="ListParagraph"/>
           </w:pPr>
         </w:p>
         <w:p>
           <w:pPr>
-            <w:pStyle w:val="Lijstalinea"/>
+            <w:pStyle w:val="ListParagraph"/>
             <w:numPr>
               <w:ilvl w:val="0"/>
               <w:numId w:val="12"/>
@@ -2946,7 +3169,7 @@
         </w:p>
         <w:p>
           <w:pPr>
-            <w:pStyle w:val="Lijstalinea"/>
+            <w:pStyle w:val="ListParagraph"/>
             <w:numPr>
               <w:ilvl w:val="0"/>
               <w:numId w:val="12"/>
@@ -2958,7 +3181,7 @@
         </w:p>
         <w:p>
           <w:pPr>
-            <w:pStyle w:val="Lijstalinea"/>
+            <w:pStyle w:val="ListParagraph"/>
             <w:numPr>
               <w:ilvl w:val="0"/>
               <w:numId w:val="12"/>
@@ -2970,24 +3193,32 @@
         </w:p>
         <w:p>
           <w:pPr>
-            <w:pStyle w:val="Lijstalinea"/>
+            <w:pStyle w:val="ListParagraph"/>
             <w:numPr>
               <w:ilvl w:val="0"/>
               <w:numId w:val="12"/>
             </w:numPr>
           </w:pPr>
           <w:r>
-            <w:t>Controleer in Apparaatbeheer (Windows) of de ESP32 herkend wordt als COM-poort.</w:t>
+            <w:t xml:space="preserve">Controleer in </w:t>
+          </w:r>
+          <w:proofErr w:type="spellStart"/>
+          <w:r>
+            <w:t>Apparaatbeheer</w:t>
+          </w:r>
+          <w:proofErr w:type="spellEnd"/>
+          <w:r>
+            <w:t xml:space="preserve"> (Windows) of de ESP32 herkend wordt als COM-poort.</w:t>
           </w:r>
         </w:p>
         <w:p>
           <w:pPr>
-            <w:pStyle w:val="Lijstalinea"/>
+            <w:pStyle w:val="ListParagraph"/>
           </w:pPr>
         </w:p>
         <w:p>
           <w:pPr>
-            <w:pStyle w:val="Kop2"/>
+            <w:pStyle w:val="Heading2"/>
           </w:pPr>
           <w:r>
             <w:t>3. Opstarten van de GUI</w:t>
@@ -2995,24 +3226,48 @@
         </w:p>
         <w:p>
           <w:r>
-            <w:t>Nadat de ESP32 is aangesloten, kan de Unity Dashboard-applicatie worden gestart.</w:t>
+            <w:t xml:space="preserve">Nadat de ESP32 is aangesloten, kan de </w:t>
+          </w:r>
+          <w:proofErr w:type="spellStart"/>
+          <w:r>
+            <w:t>Unity</w:t>
+          </w:r>
+          <w:proofErr w:type="spellEnd"/>
+          <w:r>
+            <w:t xml:space="preserve"> Dashboard-applicatie worden gestart.</w:t>
           </w:r>
         </w:p>
         <w:p>
           <w:pPr>
-            <w:pStyle w:val="Lijstalinea"/>
+            <w:pStyle w:val="ListParagraph"/>
             <w:numPr>
               <w:ilvl w:val="0"/>
               <w:numId w:val="14"/>
             </w:numPr>
           </w:pPr>
           <w:r>
-            <w:t>Navigeer naar de map met de Unity .exe van het dashboard.</w:t>
+            <w:t xml:space="preserve">Navigeer naar de map met de </w:t>
+          </w:r>
+          <w:proofErr w:type="spellStart"/>
+          <w:r>
+            <w:t>Unity</w:t>
+          </w:r>
+          <w:proofErr w:type="spellEnd"/>
+          <w:r>
+            <w:t xml:space="preserve"> .</w:t>
+          </w:r>
+          <w:proofErr w:type="spellStart"/>
+          <w:r>
+            <w:t>exe</w:t>
+          </w:r>
+          <w:proofErr w:type="spellEnd"/>
+          <w:r>
+            <w:t xml:space="preserve"> van het dashboard.</w:t>
           </w:r>
         </w:p>
         <w:p>
           <w:pPr>
-            <w:pStyle w:val="Lijstalinea"/>
+            <w:pStyle w:val="ListParagraph"/>
             <w:numPr>
               <w:ilvl w:val="0"/>
               <w:numId w:val="14"/>
@@ -3020,12 +3275,20 @@
           </w:pPr>
           <w:r>
             <w:lastRenderedPageBreak/>
-            <w:t>Dubbelklik op de .exe om de applicatie te starten.</w:t>
+            <w:t>Dubbelklik op de .</w:t>
+          </w:r>
+          <w:proofErr w:type="spellStart"/>
+          <w:r>
+            <w:t>exe</w:t>
+          </w:r>
+          <w:proofErr w:type="spellEnd"/>
+          <w:r>
+            <w:t xml:space="preserve"> om de applicatie te starten.</w:t>
           </w:r>
         </w:p>
         <w:p>
           <w:pPr>
-            <w:pStyle w:val="Lijstalinea"/>
+            <w:pStyle w:val="ListParagraph"/>
             <w:numPr>
               <w:ilvl w:val="0"/>
               <w:numId w:val="14"/>
@@ -3037,24 +3300,32 @@
         </w:p>
         <w:p>
           <w:pPr>
-            <w:pStyle w:val="Lijstalinea"/>
+            <w:pStyle w:val="ListParagraph"/>
             <w:numPr>
               <w:ilvl w:val="0"/>
               <w:numId w:val="14"/>
             </w:numPr>
           </w:pPr>
           <w:r>
-            <w:t>Controleer de werking door het schaalmodel voorzichtig te kantelen. De 3D-visualisatie moet de rotatie in realtime volgen.</w:t>
+            <w:t xml:space="preserve">Controleer de werking door het schaalmodel voorzichtig te kantelen. De 3D-visualisatie moet de rotatie in </w:t>
+          </w:r>
+          <w:proofErr w:type="spellStart"/>
+          <w:r>
+            <w:t>realtime</w:t>
+          </w:r>
+          <w:proofErr w:type="spellEnd"/>
+          <w:r>
+            <w:t xml:space="preserve"> volgen.</w:t>
           </w:r>
         </w:p>
         <w:p>
           <w:pPr>
-            <w:pStyle w:val="Lijstalinea"/>
+            <w:pStyle w:val="ListParagraph"/>
           </w:pPr>
         </w:p>
         <w:p>
           <w:pPr>
-            <w:pStyle w:val="Kop2"/>
+            <w:pStyle w:val="Heading2"/>
           </w:pPr>
           <w:r>
             <w:t>4. Probleemoplossing</w:t>
@@ -3062,7 +3333,7 @@
         </w:p>
         <w:p>
           <w:pPr>
-            <w:pStyle w:val="Lijstalinea"/>
+            <w:pStyle w:val="ListParagraph"/>
             <w:ind w:left="0"/>
           </w:pPr>
           <w:r>
@@ -3071,7 +3342,7 @@
         </w:p>
         <w:p>
           <w:pPr>
-            <w:pStyle w:val="Kop3"/>
+            <w:pStyle w:val="Heading3"/>
             <w:ind w:firstLine="360"/>
           </w:pPr>
           <w:r>
@@ -3083,19 +3354,27 @@
         </w:p>
         <w:p>
           <w:pPr>
-            <w:pStyle w:val="Lijstalinea"/>
+            <w:pStyle w:val="ListParagraph"/>
             <w:numPr>
               <w:ilvl w:val="0"/>
               <w:numId w:val="15"/>
             </w:numPr>
           </w:pPr>
           <w:r>
-            <w:t>Druk kort op de RESET-knop op de ESP32 (labeled EN of RST op het bord).</w:t>
+            <w:t>Druk kort op de RESET-knop op de ESP32 (</w:t>
+          </w:r>
+          <w:proofErr w:type="spellStart"/>
+          <w:r>
+            <w:t>labeled</w:t>
+          </w:r>
+          <w:proofErr w:type="spellEnd"/>
+          <w:r>
+            <w:t xml:space="preserve"> EN of RST op het bord).</w:t>
           </w:r>
         </w:p>
         <w:p>
           <w:pPr>
-            <w:pStyle w:val="Lijstalinea"/>
+            <w:pStyle w:val="ListParagraph"/>
             <w:numPr>
               <w:ilvl w:val="0"/>
               <w:numId w:val="15"/>
@@ -3107,24 +3386,35 @@
         </w:p>
         <w:p>
           <w:pPr>
-            <w:pStyle w:val="Lijstalinea"/>
+            <w:pStyle w:val="ListParagraph"/>
             <w:numPr>
               <w:ilvl w:val="0"/>
               <w:numId w:val="15"/>
             </w:numPr>
           </w:pPr>
           <w:r>
-            <w:t>Herstart de Unity .exe als de verbinding na de reset nog niet hersteld is.</w:t>
+            <w:t xml:space="preserve">Herstart de </w:t>
+          </w:r>
+          <w:proofErr w:type="spellStart"/>
+          <w:r>
+            <w:t>Unity</w:t>
+          </w:r>
+          <w:proofErr w:type="spellEnd"/>
+          <w:r>
+            <w:t xml:space="preserve"> .</w:t>
+          </w:r>
+          <w:proofErr w:type="spellStart"/>
+          <w:r>
+            <w:t>exe</w:t>
+          </w:r>
+          <w:proofErr w:type="spellEnd"/>
+          <w:r>
+            <w:t xml:space="preserve"> als de verbinding na de reset nog niet hersteld is.</w:t>
           </w:r>
         </w:p>
         <w:p>
           <w:pPr>
-            <w:pStyle w:val="Lijstalinea"/>
-          </w:pPr>
-        </w:p>
-        <w:p>
-          <w:pPr>
-            <w:pStyle w:val="Kop3"/>
+            <w:pStyle w:val="Heading3"/>
             <w:ind w:firstLine="360"/>
           </w:pPr>
           <w:r>
@@ -3133,19 +3423,27 @@
         </w:p>
         <w:p>
           <w:pPr>
-            <w:pStyle w:val="Lijstalinea"/>
+            <w:pStyle w:val="ListParagraph"/>
             <w:numPr>
               <w:ilvl w:val="0"/>
               <w:numId w:val="16"/>
             </w:numPr>
           </w:pPr>
           <w:r>
-            <w:t>Open Apparaatbeheer en controleer of de ESP32 zichtbaar is onder Poorten (COM &amp; LPT).</w:t>
+            <w:t xml:space="preserve">Open </w:t>
+          </w:r>
+          <w:proofErr w:type="spellStart"/>
+          <w:r>
+            <w:t>Apparaatbeheer</w:t>
+          </w:r>
+          <w:proofErr w:type="spellEnd"/>
+          <w:r>
+            <w:t xml:space="preserve"> en controleer of de ESP32 zichtbaar is onder Poorten (COM &amp; LPT).</w:t>
           </w:r>
         </w:p>
         <w:p>
           <w:pPr>
-            <w:pStyle w:val="Lijstalinea"/>
+            <w:pStyle w:val="ListParagraph"/>
             <w:numPr>
               <w:ilvl w:val="0"/>
               <w:numId w:val="16"/>
@@ -3157,7 +3455,7 @@
         </w:p>
         <w:p>
           <w:pPr>
-            <w:pStyle w:val="Lijstalinea"/>
+            <w:pStyle w:val="ListParagraph"/>
             <w:numPr>
               <w:ilvl w:val="0"/>
               <w:numId w:val="16"/>
@@ -3169,12 +3467,51 @@
         </w:p>
         <w:p>
           <w:pPr>
-            <w:pStyle w:val="Lijstalinea"/>
+            <w:pStyle w:val="ListParagraph"/>
+            <w:numPr>
+              <w:ilvl w:val="0"/>
+              <w:numId w:val="16"/>
+            </w:numPr>
           </w:pPr>
+          <w:r>
+            <w:t xml:space="preserve">Als dit ook nog niet werkt, gelieve in dezelfde map als waar de </w:t>
+          </w:r>
+          <w:proofErr w:type="spellStart"/>
+          <w:r>
+            <w:t>Unity</w:t>
+          </w:r>
+          <w:proofErr w:type="spellEnd"/>
+          <w:r>
+            <w:t xml:space="preserve"> .</w:t>
+          </w:r>
+          <w:proofErr w:type="spellStart"/>
+          <w:r>
+            <w:t>exe</w:t>
+          </w:r>
+          <w:proofErr w:type="spellEnd"/>
+          <w:r>
+            <w:t xml:space="preserve"> staat, in “</w:t>
+          </w:r>
+          <w:proofErr w:type="spellStart"/>
+          <w:r>
+            <w:t>config</w:t>
+          </w:r>
+          <w:proofErr w:type="spellEnd"/>
+          <w:r>
+            <w:t>” aanpassen welke COM poort de ESP32 op zit (dit is te vinden in ‘</w:t>
+          </w:r>
+          <w:proofErr w:type="spellStart"/>
+          <w:r>
+            <w:t>apparaatbeheer</w:t>
+          </w:r>
+          <w:proofErr w:type="spellEnd"/>
+          <w:r>
+            <w:t>/device manager’).</w:t>
+          </w:r>
         </w:p>
         <w:p>
           <w:pPr>
-            <w:pStyle w:val="Kop3"/>
+            <w:pStyle w:val="Heading3"/>
             <w:ind w:firstLine="360"/>
           </w:pPr>
           <w:r>
@@ -3183,7 +3520,7 @@
         </w:p>
         <w:p>
           <w:pPr>
-            <w:pStyle w:val="Lijstalinea"/>
+            <w:pStyle w:val="ListParagraph"/>
             <w:numPr>
               <w:ilvl w:val="0"/>
               <w:numId w:val="17"/>
@@ -3195,7 +3532,7 @@
         </w:p>
         <w:p>
           <w:pPr>
-            <w:pStyle w:val="Lijstalinea"/>
+            <w:pStyle w:val="ListParagraph"/>
             <w:numPr>
               <w:ilvl w:val="0"/>
               <w:numId w:val="17"/>
@@ -3207,14 +3544,14 @@
         </w:p>
         <w:p>
           <w:pPr>
-            <w:pStyle w:val="Lijstalinea"/>
+            <w:pStyle w:val="ListParagraph"/>
           </w:pPr>
         </w:p>
       </w:sdtContent>
     </w:sdt>
     <w:p>
       <w:pPr>
-        <w:pStyle w:val="Kop1"/>
+        <w:pStyle w:val="Heading1"/>
       </w:pPr>
       <w:bookmarkStart w:id="9" w:name="_Toc223435312"/>
       <w:r>
@@ -3224,7 +3561,7 @@
     </w:p>
     <w:tbl>
       <w:tblPr>
-        <w:tblStyle w:val="Rastertabel2-Accent5"/>
+        <w:tblStyle w:val="GridTable2-Accent5"/>
         <w:tblW w:w="0" w:type="auto"/>
         <w:tblLook w:val="04A0" w:firstRow="1" w:lastRow="0" w:firstColumn="1" w:lastColumn="0" w:noHBand="0" w:noVBand="1"/>
       </w:tblPr>
@@ -3423,7 +3760,7 @@
     <w:sdtContent>
       <w:p>
         <w:pPr>
-          <w:pStyle w:val="Voettekst"/>
+          <w:pStyle w:val="Footer"/>
           <w:jc w:val="right"/>
         </w:pPr>
         <w:r>
@@ -3446,7 +3783,7 @@
   </w:sdt>
   <w:p>
     <w:pPr>
-      <w:pStyle w:val="Voettekst"/>
+      <w:pStyle w:val="Footer"/>
     </w:pPr>
   </w:p>
 </w:ftr>
@@ -5619,7 +5956,7 @@
     <w:lsdException w:name="Unresolved Mention" w:semiHidden="1" w:unhideWhenUsed="1"/>
     <w:lsdException w:name="Smart Link" w:semiHidden="1" w:unhideWhenUsed="1"/>
   </w:latentStyles>
-  <w:style w:type="paragraph" w:default="1" w:styleId="Standaard">
+  <w:style w:type="paragraph" w:default="1" w:styleId="Normal">
     <w:name w:val="Normal"/>
     <w:qFormat/>
     <w:rsid w:val="00A266FD"/>
@@ -5627,11 +5964,11 @@
       <w:lang w:val="nl-NL"/>
     </w:rPr>
   </w:style>
-  <w:style w:type="paragraph" w:styleId="Kop1">
+  <w:style w:type="paragraph" w:styleId="Heading1">
     <w:name w:val="heading 1"/>
-    <w:basedOn w:val="Standaard"/>
-    <w:next w:val="Standaard"/>
-    <w:link w:val="Kop1Char"/>
+    <w:basedOn w:val="Normal"/>
+    <w:next w:val="Normal"/>
+    <w:link w:val="Heading1Char"/>
     <w:uiPriority w:val="9"/>
     <w:qFormat/>
     <w:rsid w:val="00CF1D52"/>
@@ -5648,11 +5985,11 @@
       <w:szCs w:val="32"/>
     </w:rPr>
   </w:style>
-  <w:style w:type="paragraph" w:styleId="Kop2">
+  <w:style w:type="paragraph" w:styleId="Heading2">
     <w:name w:val="heading 2"/>
-    <w:basedOn w:val="Standaard"/>
-    <w:next w:val="Standaard"/>
-    <w:link w:val="Kop2Char"/>
+    <w:basedOn w:val="Normal"/>
+    <w:next w:val="Normal"/>
+    <w:link w:val="Heading2Char"/>
     <w:uiPriority w:val="9"/>
     <w:unhideWhenUsed/>
     <w:qFormat/>
@@ -5670,11 +6007,11 @@
       <w:szCs w:val="26"/>
     </w:rPr>
   </w:style>
-  <w:style w:type="paragraph" w:styleId="Kop3">
+  <w:style w:type="paragraph" w:styleId="Heading3">
     <w:name w:val="heading 3"/>
-    <w:basedOn w:val="Standaard"/>
-    <w:next w:val="Standaard"/>
-    <w:link w:val="Kop3Char"/>
+    <w:basedOn w:val="Normal"/>
+    <w:next w:val="Normal"/>
+    <w:link w:val="Heading3Char"/>
     <w:uiPriority w:val="9"/>
     <w:unhideWhenUsed/>
     <w:qFormat/>
@@ -5692,13 +6029,13 @@
       <w:szCs w:val="24"/>
     </w:rPr>
   </w:style>
-  <w:style w:type="character" w:default="1" w:styleId="Standaardalinea-lettertype">
+  <w:style w:type="character" w:default="1" w:styleId="DefaultParagraphFont">
     <w:name w:val="Default Paragraph Font"/>
     <w:uiPriority w:val="1"/>
     <w:semiHidden/>
     <w:unhideWhenUsed/>
   </w:style>
-  <w:style w:type="table" w:default="1" w:styleId="Standaardtabel">
+  <w:style w:type="table" w:default="1" w:styleId="TableNormal">
     <w:name w:val="Normal Table"/>
     <w:uiPriority w:val="99"/>
     <w:semiHidden/>
@@ -5713,15 +6050,15 @@
       </w:tblCellMar>
     </w:tblPr>
   </w:style>
-  <w:style w:type="numbering" w:default="1" w:styleId="Geenlijst">
+  <w:style w:type="numbering" w:default="1" w:styleId="NoList">
     <w:name w:val="No List"/>
     <w:uiPriority w:val="99"/>
     <w:semiHidden/>
     <w:unhideWhenUsed/>
   </w:style>
-  <w:style w:type="paragraph" w:styleId="Geenafstand">
+  <w:style w:type="paragraph" w:styleId="NoSpacing">
     <w:name w:val="No Spacing"/>
-    <w:link w:val="GeenafstandChar"/>
+    <w:link w:val="NoSpacingChar"/>
     <w:uiPriority w:val="1"/>
     <w:qFormat/>
     <w:rsid w:val="00CF1D52"/>
@@ -5734,10 +6071,10 @@
       <w14:ligatures w14:val="none"/>
     </w:rPr>
   </w:style>
-  <w:style w:type="character" w:customStyle="1" w:styleId="GeenafstandChar">
-    <w:name w:val="Geen afstand Char"/>
-    <w:basedOn w:val="Standaardalinea-lettertype"/>
-    <w:link w:val="Geenafstand"/>
+  <w:style w:type="character" w:customStyle="1" w:styleId="NoSpacingChar">
+    <w:name w:val="No Spacing Char"/>
+    <w:basedOn w:val="DefaultParagraphFont"/>
+    <w:link w:val="NoSpacing"/>
     <w:uiPriority w:val="1"/>
     <w:rsid w:val="00CF1D52"/>
     <w:rPr>
@@ -5747,10 +6084,10 @@
       <w14:ligatures w14:val="none"/>
     </w:rPr>
   </w:style>
-  <w:style w:type="character" w:customStyle="1" w:styleId="Kop1Char">
-    <w:name w:val="Kop 1 Char"/>
-    <w:basedOn w:val="Standaardalinea-lettertype"/>
-    <w:link w:val="Kop1"/>
+  <w:style w:type="character" w:customStyle="1" w:styleId="Heading1Char">
+    <w:name w:val="Heading 1 Char"/>
+    <w:basedOn w:val="DefaultParagraphFont"/>
+    <w:link w:val="Heading1"/>
     <w:uiPriority w:val="9"/>
     <w:rsid w:val="00CF1D52"/>
     <w:rPr>
@@ -5760,10 +6097,10 @@
       <w:szCs w:val="32"/>
     </w:rPr>
   </w:style>
-  <w:style w:type="paragraph" w:styleId="Kopvaninhoudsopgave">
+  <w:style w:type="paragraph" w:styleId="TOCHeading">
     <w:name w:val="TOC Heading"/>
-    <w:basedOn w:val="Kop1"/>
-    <w:next w:val="Standaard"/>
+    <w:basedOn w:val="Heading1"/>
+    <w:next w:val="Normal"/>
     <w:uiPriority w:val="39"/>
     <w:unhideWhenUsed/>
     <w:qFormat/>
@@ -5776,10 +6113,10 @@
       <w14:ligatures w14:val="none"/>
     </w:rPr>
   </w:style>
-  <w:style w:type="paragraph" w:styleId="Plattetekst">
+  <w:style w:type="paragraph" w:styleId="BodyText">
     <w:name w:val="Body Text"/>
-    <w:basedOn w:val="Standaard"/>
-    <w:link w:val="PlattetekstChar"/>
+    <w:basedOn w:val="Normal"/>
+    <w:link w:val="BodyTextChar"/>
     <w:uiPriority w:val="1"/>
     <w:qFormat/>
     <w:rsid w:val="00892426"/>
@@ -5797,10 +6134,10 @@
       <w14:ligatures w14:val="none"/>
     </w:rPr>
   </w:style>
-  <w:style w:type="character" w:customStyle="1" w:styleId="PlattetekstChar">
-    <w:name w:val="Platte tekst Char"/>
-    <w:basedOn w:val="Standaardalinea-lettertype"/>
-    <w:link w:val="Plattetekst"/>
+  <w:style w:type="character" w:customStyle="1" w:styleId="BodyTextChar">
+    <w:name w:val="Body Text Char"/>
+    <w:basedOn w:val="DefaultParagraphFont"/>
+    <w:link w:val="BodyText"/>
     <w:uiPriority w:val="1"/>
     <w:rsid w:val="00892426"/>
     <w:rPr>
@@ -5812,9 +6149,9 @@
       <w14:ligatures w14:val="none"/>
     </w:rPr>
   </w:style>
-  <w:style w:type="table" w:styleId="Tabelraster">
+  <w:style w:type="table" w:styleId="TableGrid">
     <w:name w:val="Table Grid"/>
-    <w:basedOn w:val="Standaardtabel"/>
+    <w:basedOn w:val="TableNormal"/>
     <w:uiPriority w:val="39"/>
     <w:rsid w:val="00495AFF"/>
     <w:pPr>
@@ -5831,9 +6168,9 @@
       </w:tblBorders>
     </w:tblPr>
   </w:style>
-  <w:style w:type="table" w:styleId="Rastertabel3-Accent1">
+  <w:style w:type="table" w:styleId="GridTable3-Accent1">
     <w:name w:val="Grid Table 3 Accent 1"/>
-    <w:basedOn w:val="Standaardtabel"/>
+    <w:basedOn w:val="TableNormal"/>
     <w:uiPriority w:val="48"/>
     <w:rsid w:val="00495AFF"/>
     <w:pPr>
@@ -5969,7 +6306,7 @@
   </w:style>
   <w:style w:type="character" w:styleId="Hyperlink">
     <w:name w:val="Hyperlink"/>
-    <w:basedOn w:val="Standaardalinea-lettertype"/>
+    <w:basedOn w:val="DefaultParagraphFont"/>
     <w:uiPriority w:val="99"/>
     <w:unhideWhenUsed/>
     <w:rsid w:val="005D4A1E"/>
@@ -5978,9 +6315,9 @@
       <w:u w:val="single"/>
     </w:rPr>
   </w:style>
-  <w:style w:type="character" w:styleId="Onopgelostemelding">
+  <w:style w:type="character" w:styleId="UnresolvedMention">
     <w:name w:val="Unresolved Mention"/>
-    <w:basedOn w:val="Standaardalinea-lettertype"/>
+    <w:basedOn w:val="DefaultParagraphFont"/>
     <w:uiPriority w:val="99"/>
     <w:semiHidden/>
     <w:unhideWhenUsed/>
@@ -5990,10 +6327,10 @@
       <w:shd w:val="clear" w:color="auto" w:fill="E1DFDD"/>
     </w:rPr>
   </w:style>
-  <w:style w:type="character" w:customStyle="1" w:styleId="Kop2Char">
-    <w:name w:val="Kop 2 Char"/>
-    <w:basedOn w:val="Standaardalinea-lettertype"/>
-    <w:link w:val="Kop2"/>
+  <w:style w:type="character" w:customStyle="1" w:styleId="Heading2Char">
+    <w:name w:val="Heading 2 Char"/>
+    <w:basedOn w:val="DefaultParagraphFont"/>
+    <w:link w:val="Heading2"/>
     <w:uiPriority w:val="9"/>
     <w:rsid w:val="00A73B7A"/>
     <w:rPr>
@@ -6003,10 +6340,10 @@
       <w:szCs w:val="26"/>
     </w:rPr>
   </w:style>
-  <w:style w:type="character" w:customStyle="1" w:styleId="Kop3Char">
-    <w:name w:val="Kop 3 Char"/>
-    <w:basedOn w:val="Standaardalinea-lettertype"/>
-    <w:link w:val="Kop3"/>
+  <w:style w:type="character" w:customStyle="1" w:styleId="Heading3Char">
+    <w:name w:val="Heading 3 Char"/>
+    <w:basedOn w:val="DefaultParagraphFont"/>
+    <w:link w:val="Heading3"/>
     <w:uiPriority w:val="9"/>
     <w:rsid w:val="00DF774F"/>
     <w:rPr>
@@ -6016,9 +6353,9 @@
       <w:szCs w:val="24"/>
     </w:rPr>
   </w:style>
-  <w:style w:type="paragraph" w:styleId="Lijstalinea">
+  <w:style w:type="paragraph" w:styleId="ListParagraph">
     <w:name w:val="List Paragraph"/>
-    <w:basedOn w:val="Standaard"/>
+    <w:basedOn w:val="Normal"/>
     <w:qFormat/>
     <w:rsid w:val="002535C7"/>
     <w:pPr>
@@ -6026,10 +6363,10 @@
       <w:contextualSpacing/>
     </w:pPr>
   </w:style>
-  <w:style w:type="paragraph" w:styleId="Inhopg2">
+  <w:style w:type="paragraph" w:styleId="TOC2">
     <w:name w:val="toc 2"/>
-    <w:basedOn w:val="Standaard"/>
-    <w:next w:val="Standaard"/>
+    <w:basedOn w:val="Normal"/>
+    <w:next w:val="Normal"/>
     <w:autoRedefine/>
     <w:uiPriority w:val="39"/>
     <w:unhideWhenUsed/>
@@ -6039,10 +6376,10 @@
       <w:ind w:left="220"/>
     </w:pPr>
   </w:style>
-  <w:style w:type="paragraph" w:styleId="Inhopg3">
+  <w:style w:type="paragraph" w:styleId="TOC3">
     <w:name w:val="toc 3"/>
-    <w:basedOn w:val="Standaard"/>
-    <w:next w:val="Standaard"/>
+    <w:basedOn w:val="Normal"/>
+    <w:next w:val="Normal"/>
     <w:autoRedefine/>
     <w:uiPriority w:val="39"/>
     <w:unhideWhenUsed/>
@@ -6052,9 +6389,9 @@
       <w:ind w:left="440"/>
     </w:pPr>
   </w:style>
-  <w:style w:type="table" w:styleId="Rastertabel4-Accent1">
+  <w:style w:type="table" w:styleId="GridTable4-Accent1">
     <w:name w:val="Grid Table 4 Accent 1"/>
-    <w:basedOn w:val="Standaardtabel"/>
+    <w:basedOn w:val="TableNormal"/>
     <w:uiPriority w:val="49"/>
     <w:rsid w:val="00B2441A"/>
     <w:pPr>
@@ -6128,10 +6465,10 @@
       </w:tcPr>
     </w:tblStylePr>
   </w:style>
-  <w:style w:type="paragraph" w:styleId="Inhopg1">
+  <w:style w:type="paragraph" w:styleId="TOC1">
     <w:name w:val="toc 1"/>
-    <w:basedOn w:val="Standaard"/>
-    <w:next w:val="Standaard"/>
+    <w:basedOn w:val="Normal"/>
+    <w:next w:val="Normal"/>
     <w:autoRedefine/>
     <w:uiPriority w:val="39"/>
     <w:unhideWhenUsed/>
@@ -6140,9 +6477,9 @@
       <w:spacing w:after="100"/>
     </w:pPr>
   </w:style>
-  <w:style w:type="table" w:styleId="Rastertabel2-Accent1">
+  <w:style w:type="table" w:styleId="GridTable2-Accent1">
     <w:name w:val="Grid Table 2 Accent 1"/>
-    <w:basedOn w:val="Standaardtabel"/>
+    <w:basedOn w:val="TableNormal"/>
     <w:uiPriority w:val="47"/>
     <w:rsid w:val="00990091"/>
     <w:pPr>
@@ -6215,9 +6552,9 @@
       </w:tcPr>
     </w:tblStylePr>
   </w:style>
-  <w:style w:type="table" w:styleId="Lijsttabel2-Accent1">
+  <w:style w:type="table" w:styleId="ListTable2-Accent1">
     <w:name w:val="List Table 2 Accent 1"/>
-    <w:basedOn w:val="Standaardtabel"/>
+    <w:basedOn w:val="TableNormal"/>
     <w:uiPriority w:val="47"/>
     <w:rsid w:val="00990091"/>
     <w:pPr>
@@ -6269,9 +6606,9 @@
       </w:tcPr>
     </w:tblStylePr>
   </w:style>
-  <w:style w:type="table" w:styleId="Rastertabel2-Accent5">
+  <w:style w:type="table" w:styleId="GridTable2-Accent5">
     <w:name w:val="Grid Table 2 Accent 5"/>
-    <w:basedOn w:val="Standaardtabel"/>
+    <w:basedOn w:val="TableNormal"/>
     <w:uiPriority w:val="47"/>
     <w:rsid w:val="001721C1"/>
     <w:pPr>
@@ -6344,9 +6681,9 @@
       </w:tcPr>
     </w:tblStylePr>
   </w:style>
-  <w:style w:type="table" w:styleId="Rastertabel4-Accent5">
+  <w:style w:type="table" w:styleId="GridTable4-Accent5">
     <w:name w:val="Grid Table 4 Accent 5"/>
-    <w:basedOn w:val="Standaardtabel"/>
+    <w:basedOn w:val="TableNormal"/>
     <w:uiPriority w:val="49"/>
     <w:rsid w:val="008748B9"/>
     <w:pPr>
@@ -6420,9 +6757,9 @@
       </w:tcPr>
     </w:tblStylePr>
   </w:style>
-  <w:style w:type="table" w:styleId="Onopgemaaktetabel2">
+  <w:style w:type="table" w:styleId="PlainTable2">
     <w:name w:val="Plain Table 2"/>
-    <w:basedOn w:val="Standaardtabel"/>
+    <w:basedOn w:val="TableNormal"/>
     <w:uiPriority w:val="42"/>
     <w:rsid w:val="00A266FD"/>
     <w:pPr>
@@ -6500,9 +6837,9 @@
       </w:tcPr>
     </w:tblStylePr>
   </w:style>
-  <w:style w:type="table" w:styleId="Lijsttabel4-Accent1">
+  <w:style w:type="table" w:styleId="ListTable4-Accent1">
     <w:name w:val="List Table 4 Accent 1"/>
-    <w:basedOn w:val="Standaardtabel"/>
+    <w:basedOn w:val="TableNormal"/>
     <w:uiPriority w:val="49"/>
     <w:rsid w:val="00A266FD"/>
     <w:pPr>
@@ -6574,10 +6911,10 @@
       </w:tcPr>
     </w:tblStylePr>
   </w:style>
-  <w:style w:type="paragraph" w:styleId="Koptekst">
+  <w:style w:type="paragraph" w:styleId="Header">
     <w:name w:val="header"/>
-    <w:basedOn w:val="Standaard"/>
-    <w:link w:val="KoptekstChar"/>
+    <w:basedOn w:val="Normal"/>
+    <w:link w:val="HeaderChar"/>
     <w:uiPriority w:val="99"/>
     <w:unhideWhenUsed/>
     <w:rsid w:val="000F02F3"/>
@@ -6589,17 +6926,17 @@
       <w:spacing w:after="0" w:line="240" w:lineRule="auto"/>
     </w:pPr>
   </w:style>
-  <w:style w:type="character" w:customStyle="1" w:styleId="KoptekstChar">
-    <w:name w:val="Koptekst Char"/>
-    <w:basedOn w:val="Standaardalinea-lettertype"/>
-    <w:link w:val="Koptekst"/>
+  <w:style w:type="character" w:customStyle="1" w:styleId="HeaderChar">
+    <w:name w:val="Header Char"/>
+    <w:basedOn w:val="DefaultParagraphFont"/>
+    <w:link w:val="Header"/>
     <w:uiPriority w:val="99"/>
     <w:rsid w:val="000F02F3"/>
   </w:style>
-  <w:style w:type="paragraph" w:styleId="Voettekst">
+  <w:style w:type="paragraph" w:styleId="Footer">
     <w:name w:val="footer"/>
-    <w:basedOn w:val="Standaard"/>
-    <w:link w:val="VoettekstChar"/>
+    <w:basedOn w:val="Normal"/>
+    <w:link w:val="FooterChar"/>
     <w:uiPriority w:val="99"/>
     <w:unhideWhenUsed/>
     <w:rsid w:val="000F02F3"/>
@@ -6611,18 +6948,18 @@
       <w:spacing w:after="0" w:line="240" w:lineRule="auto"/>
     </w:pPr>
   </w:style>
-  <w:style w:type="character" w:customStyle="1" w:styleId="VoettekstChar">
-    <w:name w:val="Voettekst Char"/>
-    <w:basedOn w:val="Standaardalinea-lettertype"/>
-    <w:link w:val="Voettekst"/>
+  <w:style w:type="character" w:customStyle="1" w:styleId="FooterChar">
+    <w:name w:val="Footer Char"/>
+    <w:basedOn w:val="DefaultParagraphFont"/>
+    <w:link w:val="Footer"/>
     <w:uiPriority w:val="99"/>
     <w:rsid w:val="000F02F3"/>
   </w:style>
-  <w:style w:type="paragraph" w:styleId="Titel">
+  <w:style w:type="paragraph" w:styleId="Title">
     <w:name w:val="Title"/>
-    <w:basedOn w:val="Standaard"/>
-    <w:next w:val="Standaard"/>
-    <w:link w:val="TitelChar"/>
+    <w:basedOn w:val="Normal"/>
+    <w:next w:val="Normal"/>
+    <w:link w:val="TitleChar"/>
     <w:uiPriority w:val="10"/>
     <w:qFormat/>
     <w:rsid w:val="00FE7BC5"/>
@@ -6638,10 +6975,10 @@
       <w:szCs w:val="56"/>
     </w:rPr>
   </w:style>
-  <w:style w:type="character" w:customStyle="1" w:styleId="TitelChar">
-    <w:name w:val="Titel Char"/>
-    <w:basedOn w:val="Standaardalinea-lettertype"/>
-    <w:link w:val="Titel"/>
+  <w:style w:type="character" w:customStyle="1" w:styleId="TitleChar">
+    <w:name w:val="Title Char"/>
+    <w:basedOn w:val="DefaultParagraphFont"/>
+    <w:link w:val="Title"/>
     <w:uiPriority w:val="10"/>
     <w:rsid w:val="00FE7BC5"/>
     <w:rPr>
@@ -6653,9 +6990,9 @@
       <w:lang w:val="nl-NL"/>
     </w:rPr>
   </w:style>
-  <w:style w:type="paragraph" w:styleId="Normaalweb">
+  <w:style w:type="paragraph" w:styleId="NormalWeb">
     <w:name w:val="Normal (Web)"/>
-    <w:basedOn w:val="Standaard"/>
+    <w:basedOn w:val="Normal"/>
     <w:uiPriority w:val="99"/>
     <w:semiHidden/>
     <w:unhideWhenUsed/>
@@ -6666,9 +7003,9 @@
       <w:szCs w:val="24"/>
     </w:rPr>
   </w:style>
-  <w:style w:type="character" w:styleId="GevolgdeHyperlink">
+  <w:style w:type="character" w:styleId="FollowedHyperlink">
     <w:name w:val="FollowedHyperlink"/>
-    <w:basedOn w:val="Standaardalinea-lettertype"/>
+    <w:basedOn w:val="DefaultParagraphFont"/>
     <w:uiPriority w:val="99"/>
     <w:semiHidden/>
     <w:unhideWhenUsed/>
@@ -6988,12 +7325,7 @@
 </file>
 
 <file path=customXml/item2.xml><?xml version="1.0" encoding="utf-8"?>
-<?mso-contentType ?>
-<FormTemplates xmlns="http://schemas.microsoft.com/sharepoint/v3/contenttype/forms">
-  <Display>DocumentLibraryForm</Display>
-  <Edit>DocumentLibraryForm</Edit>
-  <New>DocumentLibraryForm</New>
-</FormTemplates>
+<b:Sources xmlns:b="http://schemas.openxmlformats.org/officeDocument/2006/bibliography" xmlns="http://schemas.openxmlformats.org/officeDocument/2006/bibliography" SelectedStyle="\APASixthEditionOfficeOnline.xsl" StyleName="APA" Version="6"/>
 </file>
 
 <file path=customXml/item3.xml><?xml version="1.0" encoding="utf-8"?>
@@ -7005,7 +7337,12 @@
 </file>
 
 <file path=customXml/item4.xml><?xml version="1.0" encoding="utf-8"?>
-<b:Sources xmlns:b="http://schemas.openxmlformats.org/officeDocument/2006/bibliography" xmlns="http://schemas.openxmlformats.org/officeDocument/2006/bibliography" SelectedStyle="\APASixthEditionOfficeOnline.xsl" StyleName="APA" Version="6"/>
+<?mso-contentType ?>
+<FormTemplates xmlns="http://schemas.microsoft.com/sharepoint/v3/contenttype/forms">
+  <Display>DocumentLibraryForm</Display>
+  <Edit>DocumentLibraryForm</Edit>
+  <New>DocumentLibraryForm</New>
+</FormTemplates>
 </file>
 
 <file path=customXml/item5.xml><?xml version="1.0" encoding="utf-8"?>
@@ -7211,9 +7548,9 @@
 </file>
 
 <file path=customXml/itemProps2.xml><?xml version="1.0" encoding="utf-8"?>
-<ds:datastoreItem xmlns:ds="http://schemas.openxmlformats.org/officeDocument/2006/customXml" ds:itemID="{70A85C5D-3D95-48EF-BA3B-DB4B30942479}">
+<ds:datastoreItem xmlns:ds="http://schemas.openxmlformats.org/officeDocument/2006/customXml" ds:itemID="{7B0CBF3D-B593-4A7C-89A1-3FCBA3015E28}">
   <ds:schemaRefs>
-    <ds:schemaRef ds:uri="http://schemas.microsoft.com/sharepoint/v3/contenttype/forms"/>
+    <ds:schemaRef ds:uri="http://schemas.openxmlformats.org/officeDocument/2006/bibliography"/>
   </ds:schemaRefs>
 </ds:datastoreItem>
 </file>
@@ -7229,9 +7566,9 @@
 </file>
 
 <file path=customXml/itemProps4.xml><?xml version="1.0" encoding="utf-8"?>
-<ds:datastoreItem xmlns:ds="http://schemas.openxmlformats.org/officeDocument/2006/customXml" ds:itemID="{7B0CBF3D-B593-4A7C-89A1-3FCBA3015E28}">
+<ds:datastoreItem xmlns:ds="http://schemas.openxmlformats.org/officeDocument/2006/customXml" ds:itemID="{70A85C5D-3D95-48EF-BA3B-DB4B30942479}">
   <ds:schemaRefs>
-    <ds:schemaRef ds:uri="http://schemas.openxmlformats.org/officeDocument/2006/bibliography"/>
+    <ds:schemaRef ds:uri="http://schemas.microsoft.com/sharepoint/v3/contenttype/forms"/>
   </ds:schemaRefs>
 </ds:datastoreItem>
 </file>

</xml_diff>